<commit_message>
v2.2: 战士数值加强 - 普攻30->38, 技能55->70, 移速4.0->4.3
</commit_message>
<xml_diff>
--- a/docs/game-design-document.docx
+++ b/docs/game-design-document.docx
@@ -32,7 +32,7 @@
           <w:color w:val="808080"/>
           <w:sz w:val="20"/>
         </w:rPr>
-        <w:t>版本: v2.1 | 引擎: Unity | 类型: 俯视角 Roguelite 生存射击</w:t>
+        <w:t>版本: v2.2 | 引擎: Unity | 类型: 俯视角 Roguelite 生存射击</w:t>
       </w:r>
     </w:p>
     <w:p>
@@ -50,10 +50,7 @@
     </w:p>
     <w:p>
       <w:r>
-        <w:rPr>
-          <w:b w:val="0"/>
-        </w:rPr>
-        <w:t>地下城生存是一款俯视角（Top-Down）的 Roguelite 生存射击游戏。玩家扮演战士或法师，在被诅咒的地下城中抵御一波又一波怪物的进攻，击败最终 Boss 获得胜利。</w:t>
+        <w:t>地下城生存是一款俯视角 Roguelite 生存射击游戏。玩家扮演战士或法师，在被诅咒的地下城中抵御怪物进攻，通过4波次清怪+Boss战获得胜利。</w:t>
       </w:r>
     </w:p>
     <w:p>
@@ -61,7 +58,7 @@
         <w:rPr>
           <w:b/>
         </w:rPr>
-        <w:t>胜利条件：通过全部 4 个波次并击杀终极 Boss「恐惧领主」（Dreadlord Boss）</w:t>
+        <w:t>胜利条件：通过全部4个波次并击杀终极Boss恐惧领主（Dreadlord Boss）</w:t>
       </w:r>
     </w:p>
     <w:p>
@@ -77,7 +74,7 @@
         <w:rPr>
           <w:b/>
         </w:rPr>
-        <w:t>游戏时长：约 5-10 分钟/局</w:t>
+        <w:t>游戏时长：约5-10分钟/局</w:t>
       </w:r>
     </w:p>
     <w:p>
@@ -184,7 +181,7 @@
               <w:rPr>
                 <w:sz w:val="18"/>
               </w:rPr>
-              <w:t>游戏分为 4 个波次，每波难度递增，给玩家清晰的阶段性目标和成长节奏</w:t>
+              <w:t>4个波次，每波难度递增，清晰的阶段性目标和成长节奏</w:t>
             </w:r>
           </w:p>
         </w:tc>
@@ -199,7 +196,7 @@
               <w:rPr>
                 <w:sz w:val="18"/>
               </w:rPr>
-              <w:t>Roguelite 升级成长</w:t>
+              <w:t>Roguelite升级成长</w:t>
             </w:r>
           </w:p>
         </w:tc>
@@ -212,7 +209,7 @@
               <w:rPr>
                 <w:sz w:val="18"/>
               </w:rPr>
-              <w:t>通过击杀敌人获取经验、升级，从随机池中选择强化能力，每局体验不同</w:t>
+              <w:t>击杀获取经验、升级，随机池中选择强化，每局体验不同</w:t>
             </w:r>
           </w:p>
         </w:tc>
@@ -240,7 +237,7 @@
               <w:rPr>
                 <w:sz w:val="18"/>
               </w:rPr>
-              <w:t>战士近战冲刺 vs 法师远程范围技能，提供不同的操作体验和策略深度</w:t>
+              <w:t>战士近战冲刺 vs 法师远程范围，不同操作体验和策略深度</w:t>
             </w:r>
           </w:p>
         </w:tc>
@@ -255,7 +252,7 @@
               <w:rPr>
                 <w:sz w:val="18"/>
               </w:rPr>
-              <w:t>简洁而可读的信息</w:t>
+              <w:t>场上数量控制</w:t>
             </w:r>
           </w:p>
         </w:tc>
@@ -268,7 +265,7 @@
               <w:rPr>
                 <w:sz w:val="18"/>
               </w:rPr>
-              <w:t>场上同时敌人上限 + 远程敌人上限的双重限制，确保战斗可管理、不混乱</w:t>
+              <w:t>同时在场敌人+远程上限双重限制，战斗可管理不混乱</w:t>
             </w:r>
           </w:p>
         </w:tc>
@@ -296,7 +293,7 @@
               <w:rPr>
                 <w:sz w:val="18"/>
               </w:rPr>
-              <w:t>每波结束后弹出升级选择 + 短暂休息期，给玩家喘息和策略规划的空间</w:t>
+              <w:t>每波结束弹出升级选择+短暂休息期，给玩家喘息和策略规划空间</w:t>
             </w:r>
           </w:p>
         </w:tc>
@@ -312,26 +309,7 @@
     </w:p>
     <w:p>
       <w:r>
-        <w:rPr>
-          <w:b w:val="0"/>
-        </w:rPr>
-        <w:t>喜欢短局、即开即玩的休闲/中度玩家</w:t>
-      </w:r>
-    </w:p>
-    <w:p>
-      <w:r>
-        <w:rPr>
-          <w:b w:val="0"/>
-        </w:rPr>
-        <w:t>对 Roguelite 和弹幕射击有兴趣的玩家</w:t>
-      </w:r>
-    </w:p>
-    <w:p>
-      <w:r>
-        <w:rPr>
-          <w:b w:val="0"/>
-        </w:rPr>
-        <w:t>偏好策略选择而非纯反应速度的玩家</w:t>
+        <w:t>喜欢短局即开即玩的休闲/中度玩家；对Roguelite和弹幕射击有兴趣；偏好策略选择而非纯反应速度。</w:t>
       </w:r>
     </w:p>
     <w:p>
@@ -344,34 +322,15 @@
     </w:p>
     <w:p>
       <w:r>
-        <w:rPr>
-          <w:b w:val="0"/>
-        </w:rPr>
-        <w:t>游戏共分为 4 个波次（Wave），每个波次有固定的怪物生成总量。玩家需清除当前波次所有怪物后才能晋级。</w:t>
+        <w:t>游戏共4个波次。每波固定怪物生成总量，清场后弹出升级选择（时间暂停）后3秒自由活动再进入下一波。Wave 4清场后生成Boss恐惧领主，击败即胜利。</w:t>
       </w:r>
     </w:p>
     <w:p>
       <w:r>
         <w:rPr>
-          <w:b w:val="0"/>
+          <w:b/>
         </w:rPr>
-        <w:t>波次推进流程：</w:t>
-      </w:r>
-    </w:p>
-    <w:p>
-      <w:r>
-        <w:rPr>
-          <w:b w:val="0"/>
-        </w:rPr>
-        <w:t>1. 当前波次所有怪物生成完毕；2. 场上不再生成新怪；3. 玩家击杀所有残余怪物；4. 弹出升级选择面板（时间暂停）；5. 选择升级后恢复，等待 3 秒自由活动；6. 下一波次开始。</w:t>
-      </w:r>
-    </w:p>
-    <w:p>
-      <w:r>
-        <w:rPr>
-          <w:b w:val="0"/>
-        </w:rPr>
-        <w:t>Wave 4 清场后不晋级，而是生成最终 Boss「恐惧领主」。击败 Boss 即获得胜利。</w:t>
+        <w:t>波次推进：生满总量停出怪 清场完毕弹出升级 3秒等待 下一波开始</w:t>
       </w:r>
     </w:p>
     <w:p>
@@ -521,7 +480,7 @@
               <w:rPr>
                 <w:sz w:val="18"/>
               </w:rPr>
-              <w:t>普攻名称</w:t>
+              <w:t>普攻</w:t>
             </w:r>
           </w:p>
         </w:tc>
@@ -534,63 +493,7 @@
               <w:rPr>
                 <w:sz w:val="18"/>
               </w:rPr>
-              <w:t>火球术 (Fireball)</w:t>
-            </w:r>
-          </w:p>
-        </w:tc>
-      </w:tr>
-      <w:tr>
-        <w:tc>
-          <w:tcPr>
-            <w:tcW w:type="dxa" w:w="4320"/>
-          </w:tcPr>
-          <w:p>
-            <w:r>
-              <w:rPr>
-                <w:sz w:val="18"/>
-              </w:rPr>
-              <w:t>普攻伤害</w:t>
-            </w:r>
-          </w:p>
-        </w:tc>
-        <w:tc>
-          <w:tcPr>
-            <w:tcW w:type="dxa" w:w="4320"/>
-          </w:tcPr>
-          <w:p>
-            <w:r>
-              <w:rPr>
-                <w:sz w:val="18"/>
-              </w:rPr>
-              <w:t>20</w:t>
-            </w:r>
-          </w:p>
-        </w:tc>
-      </w:tr>
-      <w:tr>
-        <w:tc>
-          <w:tcPr>
-            <w:tcW w:type="dxa" w:w="4320"/>
-          </w:tcPr>
-          <w:p>
-            <w:r>
-              <w:rPr>
-                <w:sz w:val="18"/>
-              </w:rPr>
-              <w:t>普攻冷却</w:t>
-            </w:r>
-          </w:p>
-        </w:tc>
-        <w:tc>
-          <w:tcPr>
-            <w:tcW w:type="dxa" w:w="4320"/>
-          </w:tcPr>
-          <w:p>
-            <w:r>
-              <w:rPr>
-                <w:sz w:val="18"/>
-              </w:rPr>
-              <w:t>0.4s</w:t>
+              <w:t>火球术20伤害/0.4s</w:t>
             </w:r>
           </w:p>
         </w:tc>
@@ -618,7 +521,7 @@
               <w:rPr>
                 <w:sz w:val="18"/>
               </w:rPr>
-              <w:t>10</w:t>
+              <w:t>10/射程2s</w:t>
             </w:r>
           </w:p>
         </w:tc>
@@ -633,7 +536,7 @@
               <w:rPr>
                 <w:sz w:val="18"/>
               </w:rPr>
-              <w:t>弹道射程</w:t>
+              <w:t>技能</w:t>
             </w:r>
           </w:p>
         </w:tc>
@@ -646,147 +549,7 @@
               <w:rPr>
                 <w:sz w:val="18"/>
               </w:rPr>
-              <w:t>2s</w:t>
-            </w:r>
-          </w:p>
-        </w:tc>
-      </w:tr>
-      <w:tr>
-        <w:tc>
-          <w:tcPr>
-            <w:tcW w:type="dxa" w:w="4320"/>
-          </w:tcPr>
-          <w:p>
-            <w:r>
-              <w:rPr>
-                <w:sz w:val="18"/>
-              </w:rPr>
-              <w:t>技能名称</w:t>
-            </w:r>
-          </w:p>
-        </w:tc>
-        <w:tc>
-          <w:tcPr>
-            <w:tcW w:type="dxa" w:w="4320"/>
-          </w:tcPr>
-          <w:p>
-            <w:r>
-              <w:rPr>
-                <w:sz w:val="18"/>
-              </w:rPr>
-              <w:t>奥术雨 (Arcane Rain)</w:t>
-            </w:r>
-          </w:p>
-        </w:tc>
-      </w:tr>
-      <w:tr>
-        <w:tc>
-          <w:tcPr>
-            <w:tcW w:type="dxa" w:w="4320"/>
-          </w:tcPr>
-          <w:p>
-            <w:r>
-              <w:rPr>
-                <w:sz w:val="18"/>
-              </w:rPr>
-              <w:t>技能伤害</w:t>
-            </w:r>
-          </w:p>
-        </w:tc>
-        <w:tc>
-          <w:tcPr>
-            <w:tcW w:type="dxa" w:w="4320"/>
-          </w:tcPr>
-          <w:p>
-            <w:r>
-              <w:rPr>
-                <w:sz w:val="18"/>
-              </w:rPr>
-              <w:t>10/跳</w:t>
-            </w:r>
-          </w:p>
-        </w:tc>
-      </w:tr>
-      <w:tr>
-        <w:tc>
-          <w:tcPr>
-            <w:tcW w:type="dxa" w:w="4320"/>
-          </w:tcPr>
-          <w:p>
-            <w:r>
-              <w:rPr>
-                <w:sz w:val="18"/>
-              </w:rPr>
-              <w:t>技能冷却</w:t>
-            </w:r>
-          </w:p>
-        </w:tc>
-        <w:tc>
-          <w:tcPr>
-            <w:tcW w:type="dxa" w:w="4320"/>
-          </w:tcPr>
-          <w:p>
-            <w:r>
-              <w:rPr>
-                <w:sz w:val="18"/>
-              </w:rPr>
-              <w:t>7s</w:t>
-            </w:r>
-          </w:p>
-        </w:tc>
-      </w:tr>
-      <w:tr>
-        <w:tc>
-          <w:tcPr>
-            <w:tcW w:type="dxa" w:w="4320"/>
-          </w:tcPr>
-          <w:p>
-            <w:r>
-              <w:rPr>
-                <w:sz w:val="18"/>
-              </w:rPr>
-              <w:t>技能范围</w:t>
-            </w:r>
-          </w:p>
-        </w:tc>
-        <w:tc>
-          <w:tcPr>
-            <w:tcW w:type="dxa" w:w="4320"/>
-          </w:tcPr>
-          <w:p>
-            <w:r>
-              <w:rPr>
-                <w:sz w:val="18"/>
-              </w:rPr>
-              <w:t>半径 2.8</w:t>
-            </w:r>
-          </w:p>
-        </w:tc>
-      </w:tr>
-      <w:tr>
-        <w:tc>
-          <w:tcPr>
-            <w:tcW w:type="dxa" w:w="4320"/>
-          </w:tcPr>
-          <w:p>
-            <w:r>
-              <w:rPr>
-                <w:sz w:val="18"/>
-              </w:rPr>
-              <w:t>技能持续</w:t>
-            </w:r>
-          </w:p>
-        </w:tc>
-        <w:tc>
-          <w:tcPr>
-            <w:tcW w:type="dxa" w:w="4320"/>
-          </w:tcPr>
-          <w:p>
-            <w:r>
-              <w:rPr>
-                <w:sz w:val="18"/>
-              </w:rPr>
-              <w:t>3s</w:t>
+              <w:t>奥术雨10/跳/7s冷却/半径2.8/持续3s</w:t>
             </w:r>
           </w:p>
         </w:tc>
@@ -822,10 +585,7 @@
     </w:tbl>
     <w:p>
       <w:r>
-        <w:rPr>
-          <w:b w:val="0"/>
-        </w:rPr>
-        <w:t>玩法特点：远程风筝型。利用高速移动保持距离，火球术持续输出，奥术雨在鼠标位置施放范围伤害并减速敌人。</w:t>
+        <w:t>远程风筝型。高速移动保持距离，火球术持续输出，奥术雨鼠标位置范围伤害并减速。</w:t>
       </w:r>
     </w:p>
     <w:p>
@@ -928,7 +688,7 @@
               <w:rPr>
                 <w:sz w:val="18"/>
               </w:rPr>
-              <w:t>4.0</w:t>
+              <w:t>4.3</w:t>
             </w:r>
           </w:p>
         </w:tc>
@@ -943,7 +703,7 @@
               <w:rPr>
                 <w:sz w:val="18"/>
               </w:rPr>
-              <w:t>普攻名称</w:t>
+              <w:t>普攻</w:t>
             </w:r>
           </w:p>
         </w:tc>
@@ -956,63 +716,7 @@
               <w:rPr>
                 <w:sz w:val="18"/>
               </w:rPr>
-              <w:t>剑气斩 (Sword Wave)</w:t>
-            </w:r>
-          </w:p>
-        </w:tc>
-      </w:tr>
-      <w:tr>
-        <w:tc>
-          <w:tcPr>
-            <w:tcW w:type="dxa" w:w="4320"/>
-          </w:tcPr>
-          <w:p>
-            <w:r>
-              <w:rPr>
-                <w:sz w:val="18"/>
-              </w:rPr>
-              <w:t>普攻伤害</w:t>
-            </w:r>
-          </w:p>
-        </w:tc>
-        <w:tc>
-          <w:tcPr>
-            <w:tcW w:type="dxa" w:w="4320"/>
-          </w:tcPr>
-          <w:p>
-            <w:r>
-              <w:rPr>
-                <w:sz w:val="18"/>
-              </w:rPr>
-              <w:t>30</w:t>
-            </w:r>
-          </w:p>
-        </w:tc>
-      </w:tr>
-      <w:tr>
-        <w:tc>
-          <w:tcPr>
-            <w:tcW w:type="dxa" w:w="4320"/>
-          </w:tcPr>
-          <w:p>
-            <w:r>
-              <w:rPr>
-                <w:sz w:val="18"/>
-              </w:rPr>
-              <w:t>普攻冷却</w:t>
-            </w:r>
-          </w:p>
-        </w:tc>
-        <w:tc>
-          <w:tcPr>
-            <w:tcW w:type="dxa" w:w="4320"/>
-          </w:tcPr>
-          <w:p>
-            <w:r>
-              <w:rPr>
-                <w:sz w:val="18"/>
-              </w:rPr>
-              <w:t>0.6s</w:t>
+              <w:t>剑气斩38伤害/0.6s</w:t>
             </w:r>
           </w:p>
         </w:tc>
@@ -1040,7 +744,7 @@
               <w:rPr>
                 <w:sz w:val="18"/>
               </w:rPr>
-              <w:t>8</w:t>
+              <w:t>8/射程0.7s</w:t>
             </w:r>
           </w:p>
         </w:tc>
@@ -1055,7 +759,7 @@
               <w:rPr>
                 <w:sz w:val="18"/>
               </w:rPr>
-              <w:t>弹道射程</w:t>
+              <w:t>技能</w:t>
             </w:r>
           </w:p>
         </w:tc>
@@ -1068,147 +772,7 @@
               <w:rPr>
                 <w:sz w:val="18"/>
               </w:rPr>
-              <w:t>0.7s</w:t>
-            </w:r>
-          </w:p>
-        </w:tc>
-      </w:tr>
-      <w:tr>
-        <w:tc>
-          <w:tcPr>
-            <w:tcW w:type="dxa" w:w="4320"/>
-          </w:tcPr>
-          <w:p>
-            <w:r>
-              <w:rPr>
-                <w:sz w:val="18"/>
-              </w:rPr>
-              <w:t>技能名称</w:t>
-            </w:r>
-          </w:p>
-        </w:tc>
-        <w:tc>
-          <w:tcPr>
-            <w:tcW w:type="dxa" w:w="4320"/>
-          </w:tcPr>
-          <w:p>
-            <w:r>
-              <w:rPr>
-                <w:sz w:val="18"/>
-              </w:rPr>
-              <w:t>突进斩 (Dash Slash)</w:t>
-            </w:r>
-          </w:p>
-        </w:tc>
-      </w:tr>
-      <w:tr>
-        <w:tc>
-          <w:tcPr>
-            <w:tcW w:type="dxa" w:w="4320"/>
-          </w:tcPr>
-          <w:p>
-            <w:r>
-              <w:rPr>
-                <w:sz w:val="18"/>
-              </w:rPr>
-              <w:t>技能伤害</w:t>
-            </w:r>
-          </w:p>
-        </w:tc>
-        <w:tc>
-          <w:tcPr>
-            <w:tcW w:type="dxa" w:w="4320"/>
-          </w:tcPr>
-          <w:p>
-            <w:r>
-              <w:rPr>
-                <w:sz w:val="18"/>
-              </w:rPr>
-              <w:t>55</w:t>
-            </w:r>
-          </w:p>
-        </w:tc>
-      </w:tr>
-      <w:tr>
-        <w:tc>
-          <w:tcPr>
-            <w:tcW w:type="dxa" w:w="4320"/>
-          </w:tcPr>
-          <w:p>
-            <w:r>
-              <w:rPr>
-                <w:sz w:val="18"/>
-              </w:rPr>
-              <w:t>技能冷却</w:t>
-            </w:r>
-          </w:p>
-        </w:tc>
-        <w:tc>
-          <w:tcPr>
-            <w:tcW w:type="dxa" w:w="4320"/>
-          </w:tcPr>
-          <w:p>
-            <w:r>
-              <w:rPr>
-                <w:sz w:val="18"/>
-              </w:rPr>
-              <w:t>6s</w:t>
-            </w:r>
-          </w:p>
-        </w:tc>
-      </w:tr>
-      <w:tr>
-        <w:tc>
-          <w:tcPr>
-            <w:tcW w:type="dxa" w:w="4320"/>
-          </w:tcPr>
-          <w:p>
-            <w:r>
-              <w:rPr>
-                <w:sz w:val="18"/>
-              </w:rPr>
-              <w:t>突进距离</w:t>
-            </w:r>
-          </w:p>
-        </w:tc>
-        <w:tc>
-          <w:tcPr>
-            <w:tcW w:type="dxa" w:w="4320"/>
-          </w:tcPr>
-          <w:p>
-            <w:r>
-              <w:rPr>
-                <w:sz w:val="18"/>
-              </w:rPr>
-              <w:t>3.5</w:t>
-            </w:r>
-          </w:p>
-        </w:tc>
-      </w:tr>
-      <w:tr>
-        <w:tc>
-          <w:tcPr>
-            <w:tcW w:type="dxa" w:w="4320"/>
-          </w:tcPr>
-          <w:p>
-            <w:r>
-              <w:rPr>
-                <w:sz w:val="18"/>
-              </w:rPr>
-              <w:t>突进时间</w:t>
-            </w:r>
-          </w:p>
-        </w:tc>
-        <w:tc>
-          <w:tcPr>
-            <w:tcW w:type="dxa" w:w="4320"/>
-          </w:tcPr>
-          <w:p>
-            <w:r>
-              <w:rPr>
-                <w:sz w:val="18"/>
-              </w:rPr>
-              <w:t>0.18s</w:t>
+              <w:t>突进斩70伤害/6s冷却/冲刺3.5/0.18s</w:t>
             </w:r>
           </w:p>
         </w:tc>
@@ -1216,10 +780,7 @@
     </w:tbl>
     <w:p>
       <w:r>
-        <w:rPr>
-          <w:b w:val="0"/>
-        </w:rPr>
-        <w:t>玩法特点：近战突进型。血量较高，剑气斩可穿透敌人（升级后）。技能沿鼠标方向高速冲刺，路径上敌人受伤害。</w:t>
+        <w:t>近战突进型。血量较高，普攻DPS(63)高于法师(50)。技能沿鼠标方向冲刺，路径敌人受伤害。</w:t>
       </w:r>
     </w:p>
     <w:p>
@@ -1252,14 +813,6 @@
       </w:pPr>
       <w:r>
         <w:t>5. 敌人系统</w:t>
-      </w:r>
-    </w:p>
-    <w:p>
-      <w:r>
-        <w:rPr>
-          <w:b w:val="0"/>
-        </w:rPr>
-        <w:t>游戏共有 5 种敌人类型（4 种普通小怪 + 1 种 Boss）：</w:t>
       </w:r>
     </w:p>
     <w:tbl>
@@ -1305,7 +858,7 @@
                 <w:b/>
                 <w:sz w:val="18"/>
               </w:rPr>
-              <w:t>攻击方式</w:t>
+              <w:t>攻击</w:t>
             </w:r>
           </w:p>
         </w:tc>
@@ -1319,7 +872,7 @@
                 <w:b/>
                 <w:sz w:val="18"/>
               </w:rPr>
-              <w:t>基础HP</w:t>
+              <w:t>HP</w:t>
             </w:r>
           </w:p>
         </w:tc>
@@ -1375,7 +928,7 @@
                 <w:b/>
                 <w:sz w:val="18"/>
               </w:rPr>
-              <w:t>攻击范围</w:t>
+              <w:t>范围</w:t>
             </w:r>
           </w:p>
         </w:tc>
@@ -1418,7 +971,7 @@
               <w:rPr>
                 <w:sz w:val="18"/>
               </w:rPr>
-              <w:t>蝙蝠 (Bat)</w:t>
+              <w:t>蝙蝠</w:t>
             </w:r>
           </w:p>
         </w:tc>
@@ -1431,7 +984,7 @@
               <w:rPr>
                 <w:sz w:val="18"/>
               </w:rPr>
-              <w:t>近战追踪</w:t>
+              <w:t>近战</w:t>
             </w:r>
           </w:p>
         </w:tc>
@@ -1537,7 +1090,7 @@
               <w:rPr>
                 <w:sz w:val="18"/>
               </w:rPr>
-              <w:t>史莱姆 (Slime)</w:t>
+              <w:t>史莱姆</w:t>
             </w:r>
           </w:p>
         </w:tc>
@@ -1550,7 +1103,7 @@
               <w:rPr>
                 <w:sz w:val="18"/>
               </w:rPr>
-              <w:t>近战追踪</w:t>
+              <w:t>近战</w:t>
             </w:r>
           </w:p>
         </w:tc>
@@ -1656,7 +1209,7 @@
               <w:rPr>
                 <w:sz w:val="18"/>
               </w:rPr>
-              <w:t>蘑菇魔 (Mushroom Fiend)</w:t>
+              <w:t>蘑菇魔</w:t>
             </w:r>
           </w:p>
         </w:tc>
@@ -1669,7 +1222,7 @@
               <w:rPr>
                 <w:sz w:val="18"/>
               </w:rPr>
-              <w:t>远程单发毒球</w:t>
+              <w:t>毒球</w:t>
             </w:r>
           </w:p>
         </w:tc>
@@ -1775,7 +1328,7 @@
               <w:rPr>
                 <w:sz w:val="18"/>
               </w:rPr>
-              <w:t>水晶灵 (Crystal Wisp)</w:t>
+              <w:t>水晶灵</w:t>
             </w:r>
           </w:p>
         </w:tc>
@@ -1788,7 +1341,7 @@
               <w:rPr>
                 <w:sz w:val="18"/>
               </w:rPr>
-              <w:t>远程单发冰刺</w:t>
+              <w:t>冰刺</w:t>
             </w:r>
           </w:p>
         </w:tc>
@@ -1894,7 +1447,7 @@
               <w:rPr>
                 <w:sz w:val="18"/>
               </w:rPr>
-              <w:t>恐惧领主 (Dreadlord)</w:t>
+              <w:t>恐惧领主</w:t>
             </w:r>
           </w:p>
         </w:tc>
@@ -1907,7 +1460,7 @@
               <w:rPr>
                 <w:sz w:val="18"/>
               </w:rPr>
-              <w:t>Slam范围重击</w:t>
+              <w:t>Slam</w:t>
             </w:r>
           </w:p>
         </w:tc>
@@ -1959,7 +1512,7 @@
               <w:rPr>
                 <w:sz w:val="18"/>
               </w:rPr>
-              <w:t>Slam 30</w:t>
+              <w:t>S30</w:t>
             </w:r>
           </w:p>
         </w:tc>
@@ -2014,10 +1567,7 @@
     </w:p>
     <w:p>
       <w:r>
-        <w:rPr>
-          <w:b w:val="0"/>
-        </w:rPr>
-        <w:t>每个波次有固定概率生成精英敌人（触发条件基于波次难度等级，不再基于游戏时间）：</w:t>
+        <w:t>基于波次难度触发（不再基于游戏时间）：</w:t>
       </w:r>
     </w:p>
     <w:tbl>
@@ -2116,7 +1666,7 @@
               <w:rPr>
                 <w:sz w:val="18"/>
               </w:rPr>
-              <w:t>精英概率</w:t>
+              <w:t>概率</w:t>
             </w:r>
           </w:p>
         </w:tc>
@@ -2196,7 +1746,7 @@
                 <w:b/>
                 <w:sz w:val="18"/>
               </w:rPr>
-              <w:t>加成项</w:t>
+              <w:t>加成</w:t>
             </w:r>
           </w:p>
         </w:tc>
@@ -2327,85 +1877,13 @@
           </w:p>
         </w:tc>
       </w:tr>
-      <w:tr>
-        <w:tc>
-          <w:tcPr>
-            <w:tcW w:type="dxa" w:w="4320"/>
-          </w:tcPr>
-          <w:p>
-            <w:r>
-              <w:rPr>
-                <w:sz w:val="18"/>
-              </w:rPr>
-              <w:t>体型</w:t>
-            </w:r>
-          </w:p>
-        </w:tc>
-        <w:tc>
-          <w:tcPr>
-            <w:tcW w:type="dxa" w:w="4320"/>
-          </w:tcPr>
-          <w:p>
-            <w:r>
-              <w:rPr>
-                <w:sz w:val="18"/>
-              </w:rPr>
-              <w:t>略大</w:t>
-            </w:r>
-          </w:p>
-        </w:tc>
-      </w:tr>
-      <w:tr>
-        <w:tc>
-          <w:tcPr>
-            <w:tcW w:type="dxa" w:w="4320"/>
-          </w:tcPr>
-          <w:p>
-            <w:r>
-              <w:rPr>
-                <w:sz w:val="18"/>
-              </w:rPr>
-              <w:t>颜色</w:t>
-            </w:r>
-          </w:p>
-        </w:tc>
-        <w:tc>
-          <w:tcPr>
-            <w:tcW w:type="dxa" w:w="4320"/>
-          </w:tcPr>
-          <w:p>
-            <w:r>
-              <w:rPr>
-                <w:sz w:val="18"/>
-              </w:rPr>
-              <w:t>特殊配色</w:t>
-            </w:r>
-          </w:p>
-        </w:tc>
-      </w:tr>
     </w:tbl>
     <w:p>
       <w:pPr>
         <w:pStyle w:val="Heading2"/>
       </w:pPr>
       <w:r>
-        <w:t>5.2 Boss：恐惧领主</w:t>
-      </w:r>
-    </w:p>
-    <w:p>
-      <w:r>
-        <w:rPr>
-          <w:b w:val="0"/>
-        </w:rPr>
-        <w:t>仅在 Wave 4 清场后出现。拥有 5 种精灵动画：待机、蓄力、重击、恢复、4帧行走循环。行为模式：追踪玩家 → 进入范围后蓄力 → Slam 范围攻击 → 恢复 → 重复。击败 Boss 即胜利。</w:t>
-      </w:r>
-    </w:p>
-    <w:p>
-      <w:pPr>
-        <w:pStyle w:val="Heading2"/>
-      </w:pPr>
-      <w:r>
-        <w:t>5.3 远程限制</w:t>
+        <w:t>5.2 远程限制</w:t>
       </w:r>
     </w:p>
     <w:tbl>
@@ -2536,10 +2014,7 @@
     </w:tbl>
     <w:p>
       <w:r>
-        <w:rPr>
-          <w:b w:val="0"/>
-        </w:rPr>
-        <w:t>超过上限时，新生成的远程敌人自动替换为近战类型。</w:t>
+        <w:t>超过上限新生成的远程敌人自动替换为近战。</w:t>
       </w:r>
     </w:p>
     <w:p>
@@ -2670,7 +2145,7 @@
               <w:rPr>
                 <w:sz w:val="18"/>
               </w:rPr>
-              <w:t>难度等级</w:t>
+              <w:t>难度</w:t>
             </w:r>
           </w:p>
         </w:tc>
@@ -2750,7 +2225,7 @@
               <w:rPr>
                 <w:sz w:val="18"/>
               </w:rPr>
-              <w:t>8只</w:t>
+              <w:t>8</w:t>
             </w:r>
           </w:p>
         </w:tc>
@@ -2763,7 +2238,7 @@
               <w:rPr>
                 <w:sz w:val="18"/>
               </w:rPr>
-              <w:t>12只</w:t>
+              <w:t>12</w:t>
             </w:r>
           </w:p>
         </w:tc>
@@ -2776,7 +2251,7 @@
               <w:rPr>
                 <w:sz w:val="18"/>
               </w:rPr>
-              <w:t>18只</w:t>
+              <w:t>18</w:t>
             </w:r>
           </w:p>
         </w:tc>
@@ -2789,7 +2264,7 @@
               <w:rPr>
                 <w:sz w:val="18"/>
               </w:rPr>
-              <w:t>24只</w:t>
+              <w:t>24</w:t>
             </w:r>
           </w:p>
         </w:tc>
@@ -2817,7 +2292,7 @@
               <w:rPr>
                 <w:sz w:val="18"/>
               </w:rPr>
-              <w:t>2只</w:t>
+              <w:t>2</w:t>
             </w:r>
           </w:p>
         </w:tc>
@@ -2830,7 +2305,7 @@
               <w:rPr>
                 <w:sz w:val="18"/>
               </w:rPr>
-              <w:t>4只</w:t>
+              <w:t>4</w:t>
             </w:r>
           </w:p>
         </w:tc>
@@ -2843,7 +2318,7 @@
               <w:rPr>
                 <w:sz w:val="18"/>
               </w:rPr>
-              <w:t>6只</w:t>
+              <w:t>6</w:t>
             </w:r>
           </w:p>
         </w:tc>
@@ -2856,7 +2331,7 @@
               <w:rPr>
                 <w:sz w:val="18"/>
               </w:rPr>
-              <w:t>6只</w:t>
+              <w:t>6</w:t>
             </w:r>
           </w:p>
         </w:tc>
@@ -2884,7 +2359,7 @@
               <w:rPr>
                 <w:sz w:val="18"/>
               </w:rPr>
-              <w:t>1只</w:t>
+              <w:t>1</w:t>
             </w:r>
           </w:p>
         </w:tc>
@@ -2897,7 +2372,7 @@
               <w:rPr>
                 <w:sz w:val="18"/>
               </w:rPr>
-              <w:t>2只</w:t>
+              <w:t>2</w:t>
             </w:r>
           </w:p>
         </w:tc>
@@ -2910,7 +2385,7 @@
               <w:rPr>
                 <w:sz w:val="18"/>
               </w:rPr>
-              <w:t>3只</w:t>
+              <w:t>3</w:t>
             </w:r>
           </w:p>
         </w:tc>
@@ -2923,7 +2398,7 @@
               <w:rPr>
                 <w:sz w:val="18"/>
               </w:rPr>
-              <w:t>3只</w:t>
+              <w:t>3</w:t>
             </w:r>
           </w:p>
         </w:tc>
@@ -2938,7 +2413,7 @@
               <w:rPr>
                 <w:sz w:val="18"/>
               </w:rPr>
-              <w:t>HP 倍率</w:t>
+              <w:t>HP倍率</w:t>
             </w:r>
           </w:p>
         </w:tc>
@@ -3206,7 +2681,7 @@
               <w:rPr>
                 <w:sz w:val="18"/>
               </w:rPr>
-              <w:t>Elite概率</w:t>
+              <w:t>精英概率</w:t>
             </w:r>
           </w:p>
         </w:tc>
@@ -3266,22 +2741,6 @@
     </w:tbl>
     <w:p>
       <w:pPr>
-        <w:pStyle w:val="Heading2"/>
-      </w:pPr>
-      <w:r>
-        <w:t>6.1 波次过渡</w:t>
-      </w:r>
-    </w:p>
-    <w:p>
-      <w:r>
-        <w:rPr>
-          <w:b w:val="0"/>
-        </w:rPr>
-        <w:t>每波清场后：1. 弹出升级选择面板（时间暂停）；2. 玩家从 3 个随机强化中选择 1 个；3. 时间恢复，等待 3 秒自由活动；4. 下一波开始出怪。</w:t>
-      </w:r>
-    </w:p>
-    <w:p>
-      <w:pPr>
         <w:pStyle w:val="Heading1"/>
       </w:pPr>
       <w:r>
@@ -3290,10 +2749,7 @@
     </w:p>
     <w:p>
       <w:r>
-        <w:rPr>
-          <w:b w:val="0"/>
-        </w:rPr>
-        <w:t>击杀敌人获得经验。经验达阈值自动升级（公式：EXP需求 = 20 + 等级 x 15）。每次升级弹出 3 选 1 强化面板。波次过渡时额外提供 1 次强化。</w:t>
+        <w:t>击杀获取经验(需求=20+等级x15)，升级3选1强化。波次过渡额外提供1次强化。</w:t>
       </w:r>
     </w:p>
     <w:p>
@@ -3355,7 +2811,7 @@
               <w:rPr>
                 <w:sz w:val="18"/>
               </w:rPr>
-              <w:t>普攻伤害 +10</w:t>
+              <w:t>普攻伤害+10</w:t>
             </w:r>
           </w:p>
         </w:tc>
@@ -3368,7 +2824,7 @@
               <w:rPr>
                 <w:sz w:val="18"/>
               </w:rPr>
-              <w:t>AttackDamage += 10</w:t>
+              <w:t>AttackDamage+=10</w:t>
             </w:r>
           </w:p>
         </w:tc>
@@ -3383,7 +2839,7 @@
               <w:rPr>
                 <w:sz w:val="18"/>
               </w:rPr>
-              <w:t>技能伤害 +5</w:t>
+              <w:t>技能伤害+5</w:t>
             </w:r>
           </w:p>
         </w:tc>
@@ -3396,7 +2852,7 @@
               <w:rPr>
                 <w:sz w:val="18"/>
               </w:rPr>
-              <w:t>SkillDamage += 5</w:t>
+              <w:t>SkillDamage+=5</w:t>
             </w:r>
           </w:p>
         </w:tc>
@@ -3411,7 +2867,7 @@
               <w:rPr>
                 <w:sz w:val="18"/>
               </w:rPr>
-              <w:t>最大生命 +20</w:t>
+              <w:t>最大生命+20</w:t>
             </w:r>
           </w:p>
         </w:tc>
@@ -3424,7 +2880,7 @@
               <w:rPr>
                 <w:sz w:val="18"/>
               </w:rPr>
-              <w:t>MaxHealth += 20, 恢复20</w:t>
+              <w:t>MaxHealth+=20恢复20</w:t>
             </w:r>
           </w:p>
         </w:tc>
@@ -3439,7 +2895,7 @@
               <w:rPr>
                 <w:sz w:val="18"/>
               </w:rPr>
-              <w:t>移动速度 +10%</w:t>
+              <w:t>移动速度+10%</w:t>
             </w:r>
           </w:p>
         </w:tc>
@@ -3467,7 +2923,7 @@
               <w:rPr>
                 <w:sz w:val="18"/>
               </w:rPr>
-              <w:t>普攻冷却 -10%</w:t>
+              <w:t>普攻冷却-10%</w:t>
             </w:r>
           </w:p>
         </w:tc>
@@ -3495,7 +2951,7 @@
               <w:rPr>
                 <w:sz w:val="18"/>
               </w:rPr>
-              <w:t>生命恢复 +40</w:t>
+              <w:t>生命恢复+40</w:t>
             </w:r>
           </w:p>
         </w:tc>
@@ -3508,7 +2964,7 @@
               <w:rPr>
                 <w:sz w:val="18"/>
               </w:rPr>
-              <w:t>立即恢复 40 HP</w:t>
+              <w:t>立即恢复40HP</w:t>
             </w:r>
           </w:p>
         </w:tc>
@@ -3523,7 +2979,7 @@
               <w:rPr>
                 <w:sz w:val="18"/>
               </w:rPr>
-              <w:t>技能冷却 -10%</w:t>
+              <w:t>技能冷却-10%</w:t>
             </w:r>
           </w:p>
         </w:tc>
@@ -3601,7 +3057,7 @@
               <w:rPr>
                 <w:sz w:val="18"/>
               </w:rPr>
-              <w:t>火球分裂</w:t>
+              <w:t>火球分裂(稀有)</w:t>
             </w:r>
           </w:p>
         </w:tc>
@@ -3614,7 +3070,7 @@
               <w:rPr>
                 <w:sz w:val="18"/>
               </w:rPr>
-              <w:t>3发散射 (稀有)</w:t>
+              <w:t>3发散射</w:t>
             </w:r>
           </w:p>
         </w:tc>
@@ -3642,7 +3098,7 @@
               <w:rPr>
                 <w:sz w:val="18"/>
               </w:rPr>
-              <w:t>范围 +0.6</w:t>
+              <w:t>范围+0.6</w:t>
             </w:r>
           </w:p>
         </w:tc>
@@ -3670,7 +3126,7 @@
               <w:rPr>
                 <w:sz w:val="18"/>
               </w:rPr>
-              <w:t>持续 +1s</w:t>
+              <w:t>持续+1s</w:t>
             </w:r>
           </w:p>
         </w:tc>
@@ -3698,7 +3154,7 @@
               <w:rPr>
                 <w:sz w:val="18"/>
               </w:rPr>
-              <w:t>间隔 x0.8</w:t>
+              <w:t>间隔x0.8</w:t>
             </w:r>
           </w:p>
         </w:tc>
@@ -3726,7 +3182,7 @@
               <w:rPr>
                 <w:sz w:val="18"/>
               </w:rPr>
-              <w:t>减速 25%-&gt;40%</w:t>
+              <w:t>减速25%-&gt;40%</w:t>
             </w:r>
           </w:p>
         </w:tc>
@@ -3819,7 +3275,7 @@
               <w:rPr>
                 <w:sz w:val="18"/>
               </w:rPr>
-              <w:t>剑气穿透</w:t>
+              <w:t>剑气穿透(稀有)</w:t>
             </w:r>
           </w:p>
         </w:tc>
@@ -3832,7 +3288,7 @@
               <w:rPr>
                 <w:sz w:val="18"/>
               </w:rPr>
-              <w:t>贯穿敌人 (稀有)</w:t>
+              <w:t>贯穿敌人</w:t>
             </w:r>
           </w:p>
         </w:tc>
@@ -3860,7 +3316,7 @@
               <w:rPr>
                 <w:sz w:val="18"/>
               </w:rPr>
-              <w:t>尺寸 x1.4</w:t>
+              <w:t>尺寸x1.4</w:t>
             </w:r>
           </w:p>
         </w:tc>
@@ -3888,7 +3344,7 @@
               <w:rPr>
                 <w:sz w:val="18"/>
               </w:rPr>
-              <w:t>命中恢复 3 HP</w:t>
+              <w:t>命中恢复3HP</w:t>
             </w:r>
           </w:p>
         </w:tc>
@@ -3972,7 +3428,7 @@
               <w:rPr>
                 <w:sz w:val="18"/>
               </w:rPr>
-              <w:t>命中后 2s 攻速翻倍</w:t>
+              <w:t>命中后2s攻速翻倍</w:t>
             </w:r>
           </w:p>
         </w:tc>
@@ -4074,7 +3530,7 @@
               <w:rPr>
                 <w:sz w:val="18"/>
               </w:rPr>
-              <w:t>W/A/S/D 或 方向键</w:t>
+              <w:t>WASD/方向键</w:t>
             </w:r>
           </w:p>
         </w:tc>
@@ -4102,7 +3558,7 @@
               <w:rPr>
                 <w:sz w:val="18"/>
               </w:rPr>
-              <w:t>鼠标移动</w:t>
+              <w:t>鼠标</w:t>
             </w:r>
           </w:p>
         </w:tc>
@@ -4130,7 +3586,7 @@
               <w:rPr>
                 <w:sz w:val="18"/>
               </w:rPr>
-              <w:t>鼠标左键（按住连发）</w:t>
+              <w:t>左键按住连发</w:t>
             </w:r>
           </w:p>
         </w:tc>
@@ -4158,7 +3614,7 @@
               <w:rPr>
                 <w:sz w:val="18"/>
               </w:rPr>
-              <w:t>E 键</w:t>
+              <w:t>E键</w:t>
             </w:r>
           </w:p>
         </w:tc>
@@ -4191,65 +3647,18 @@
           </w:p>
         </w:tc>
       </w:tr>
-      <w:tr>
-        <w:tc>
-          <w:tcPr>
-            <w:tcW w:type="dxa" w:w="4320"/>
-          </w:tcPr>
-          <w:p>
-            <w:r>
-              <w:rPr>
-                <w:sz w:val="18"/>
-              </w:rPr>
-              <w:t>无敌开关</w:t>
-            </w:r>
-          </w:p>
-        </w:tc>
-        <w:tc>
-          <w:tcPr>
-            <w:tcW w:type="dxa" w:w="4320"/>
-          </w:tcPr>
-          <w:p>
-            <w:r>
-              <w:rPr>
-                <w:sz w:val="18"/>
-              </w:rPr>
-              <w:t>UI 按钮（调试用）</w:t>
-            </w:r>
-          </w:p>
-        </w:tc>
-      </w:tr>
     </w:tbl>
     <w:p>
       <w:pPr>
         <w:pStyle w:val="Heading1"/>
       </w:pPr>
       <w:r>
-        <w:t>9. UI 界面设计</w:t>
+        <w:t>9. UI界面设计</w:t>
       </w:r>
     </w:p>
     <w:p>
       <w:r>
-        <w:rPr>
-          <w:b w:val="0"/>
-        </w:rPr>
-        <w:t>游戏内 HUD：顶部状态栏（击杀数、波次进度、危险等级）+ 底部信息栏（角色名、等级、生命条、经验条、普攻/技能信息）。</w:t>
-      </w:r>
-    </w:p>
-    <w:p>
-      <w:r>
-        <w:rPr>
-          <w:b w:val="0"/>
-        </w:rPr>
-        <w:t>Boss 战阶段：顶部波次显示切换为闪烁的「终极对决！」。低血量警告：HP &lt; 30% 时血条闪烁红色。</w:t>
-      </w:r>
-    </w:p>
-    <w:p>
-      <w:r>
-        <w:rPr>
-          <w:b w:val="0"/>
-        </w:rPr>
-        <w:t>结算面板：展示生存时间、击杀数、等级、通关波次、评价等级。</w:t>
+        <w:t>顶部状态栏(击杀数/波次进度/危险等级)；底部信息栏(角色名/等级/HP条/EXP条/普攻/技能)。Boss战时闪烁【终极对决!】。HP&lt;30%血条闪烁。结算面板展示生存时间/击杀数/等级/通关波次/评价。</w:t>
       </w:r>
     </w:p>
     <w:p>
@@ -4278,30 +3687,6 @@
     </w:p>
     <w:p>
       <w:pPr>
-        <w:jc w:val="center"/>
-      </w:pPr>
-      <w:r>
-        <w:rPr>
-          <w:color w:val="B4B4B4"/>
-          <w:sz w:val="24"/>
-        </w:rPr>
-        <w:t>[ 截图预留位置 ]</w:t>
-      </w:r>
-    </w:p>
-    <w:p>
-      <w:pPr>
-        <w:jc w:val="center"/>
-      </w:pPr>
-      <w:r>
-        <w:rPr>
-          <w:color w:val="808080"/>
-          <w:sz w:val="18"/>
-        </w:rPr>
-        <w:t>图 7：Boss 战阶段的 HUD 显示</w:t>
-      </w:r>
-    </w:p>
-    <w:p>
-      <w:pPr>
         <w:pStyle w:val="Heading1"/>
       </w:pPr>
       <w:r>
@@ -4310,18 +3695,7 @@
     </w:p>
     <w:p>
       <w:r>
-        <w:rPr>
-          <w:b w:val="0"/>
-        </w:rPr>
-        <w:t>场景：黑暗奇幻主题，地下城废墟风格，深色地面配符文和魔法阵装饰。24x14 竞技场。障碍物系统（祭坛、石柱）阻挡移动。</w:t>
-      </w:r>
-    </w:p>
-    <w:p>
-      <w:r>
-        <w:rPr>
-          <w:b w:val="0"/>
-        </w:rPr>
-        <w:t>特效：圆形冲击波、伤害数字、拖尾效果、临时精灵（自动销毁淡出）、屏幕震动。精灵素材为像素风格 (Pixel Art)。</w:t>
+        <w:t>黑暗奇幻地下城废墟，24x14竞技场。特效：圆形冲击波、伤害数字、拖尾、临时精灵、屏幕震动。像素风格。</w:t>
       </w:r>
     </w:p>
     <w:p>
@@ -4345,7 +3719,7 @@
           <w:color w:val="808080"/>
           <w:sz w:val="18"/>
         </w:rPr>
-        <w:t>图 8：游戏战斗场景全景</w:t>
+        <w:t>图 7：战斗场景全景</w:t>
       </w:r>
     </w:p>
     <w:p>
@@ -4358,18 +3732,12 @@
     </w:p>
     <w:p>
       <w:r>
-        <w:rPr>
-          <w:b w:val="0"/>
-        </w:rPr>
-        <w:t>脚本结构：Core（核心控制器/数据）、Player（输入/生命）、Enemy（AI/生成）、Combat（弹道/技能/特效）、Upgrade（升级管理）、UI（界面）六个模块。</w:t>
+        <w:t>脚本分为6个模块：Core(核心/数据)、Player(输入/生命)、Enemy(AI/生成)、Combat(弹道/技能/特效)、Upgrade(升级)、UI(界面)。</w:t>
       </w:r>
     </w:p>
     <w:p>
       <w:r>
-        <w:rPr>
-          <w:b w:val="0"/>
-        </w:rPr>
-        <w:t>设计模式：单例 (GameManager)、策略 (敌人AI枚举)、工厂 (特效)、观察者 (回调链)、协程 (过渡动画)。</w:t>
+        <w:t>设计模式：单例(GameManager)、策略(敌人AI枚举)、工厂(特效)、观察者(回调链)、协程(过渡动画)。</w:t>
       </w:r>
     </w:p>
     <w:p>
@@ -4377,7 +3745,7 @@
         <w:pStyle w:val="Heading1"/>
       </w:pPr>
       <w:r>
-        <w:t>12. 附录：数据速查表</w:t>
+        <w:t>12. 附录</w:t>
       </w:r>
     </w:p>
     <w:p>
@@ -4385,7 +3753,7 @@
         <w:pStyle w:val="Heading2"/>
       </w:pPr>
       <w:r>
-        <w:t>12.1 角色属性对比</w:t>
+        <w:t>12.1 角色对比</w:t>
       </w:r>
     </w:p>
     <w:tbl>
@@ -4508,7 +3876,7 @@
               <w:rPr>
                 <w:sz w:val="18"/>
               </w:rPr>
-              <w:t>4.0</w:t>
+              <w:t>4.3</w:t>
             </w:r>
           </w:p>
         </w:tc>
@@ -4536,47 +3904,6 @@
               <w:rPr>
                 <w:sz w:val="18"/>
               </w:rPr>
-              <w:t>普攻名</w:t>
-            </w:r>
-          </w:p>
-        </w:tc>
-        <w:tc>
-          <w:tcPr>
-            <w:tcW w:type="dxa" w:w="2880"/>
-          </w:tcPr>
-          <w:p>
-            <w:r>
-              <w:rPr>
-                <w:sz w:val="18"/>
-              </w:rPr>
-              <w:t>剑气斩</w:t>
-            </w:r>
-          </w:p>
-        </w:tc>
-        <w:tc>
-          <w:tcPr>
-            <w:tcW w:type="dxa" w:w="2880"/>
-          </w:tcPr>
-          <w:p>
-            <w:r>
-              <w:rPr>
-                <w:sz w:val="18"/>
-              </w:rPr>
-              <w:t>火球术</w:t>
-            </w:r>
-          </w:p>
-        </w:tc>
-      </w:tr>
-      <w:tr>
-        <w:tc>
-          <w:tcPr>
-            <w:tcW w:type="dxa" w:w="2880"/>
-          </w:tcPr>
-          <w:p>
-            <w:r>
-              <w:rPr>
-                <w:sz w:val="18"/>
-              </w:rPr>
               <w:t>普攻伤</w:t>
             </w:r>
           </w:p>
@@ -4590,7 +3917,7 @@
               <w:rPr>
                 <w:sz w:val="18"/>
               </w:rPr>
-              <w:t>30</w:t>
+              <w:t>38</w:t>
             </w:r>
           </w:p>
         </w:tc>
@@ -4659,88 +3986,6 @@
               <w:rPr>
                 <w:sz w:val="18"/>
               </w:rPr>
-              <w:t>弹速</w:t>
-            </w:r>
-          </w:p>
-        </w:tc>
-        <w:tc>
-          <w:tcPr>
-            <w:tcW w:type="dxa" w:w="2880"/>
-          </w:tcPr>
-          <w:p>
-            <w:r>
-              <w:rPr>
-                <w:sz w:val="18"/>
-              </w:rPr>
-              <w:t>8</w:t>
-            </w:r>
-          </w:p>
-        </w:tc>
-        <w:tc>
-          <w:tcPr>
-            <w:tcW w:type="dxa" w:w="2880"/>
-          </w:tcPr>
-          <w:p>
-            <w:r>
-              <w:rPr>
-                <w:sz w:val="18"/>
-              </w:rPr>
-              <w:t>10</w:t>
-            </w:r>
-          </w:p>
-        </w:tc>
-      </w:tr>
-      <w:tr>
-        <w:tc>
-          <w:tcPr>
-            <w:tcW w:type="dxa" w:w="2880"/>
-          </w:tcPr>
-          <w:p>
-            <w:r>
-              <w:rPr>
-                <w:sz w:val="18"/>
-              </w:rPr>
-              <w:t>技能名</w:t>
-            </w:r>
-          </w:p>
-        </w:tc>
-        <w:tc>
-          <w:tcPr>
-            <w:tcW w:type="dxa" w:w="2880"/>
-          </w:tcPr>
-          <w:p>
-            <w:r>
-              <w:rPr>
-                <w:sz w:val="18"/>
-              </w:rPr>
-              <w:t>突进斩</w:t>
-            </w:r>
-          </w:p>
-        </w:tc>
-        <w:tc>
-          <w:tcPr>
-            <w:tcW w:type="dxa" w:w="2880"/>
-          </w:tcPr>
-          <w:p>
-            <w:r>
-              <w:rPr>
-                <w:sz w:val="18"/>
-              </w:rPr>
-              <w:t>奥术雨</w:t>
-            </w:r>
-          </w:p>
-        </w:tc>
-      </w:tr>
-      <w:tr>
-        <w:tc>
-          <w:tcPr>
-            <w:tcW w:type="dxa" w:w="2880"/>
-          </w:tcPr>
-          <w:p>
-            <w:r>
-              <w:rPr>
-                <w:sz w:val="18"/>
-              </w:rPr>
               <w:t>技能伤</w:t>
             </w:r>
           </w:p>
@@ -4754,7 +3999,7 @@
               <w:rPr>
                 <w:sz w:val="18"/>
               </w:rPr>
-              <w:t>55</w:t>
+              <w:t>70</w:t>
             </w:r>
           </w:p>
         </w:tc>
@@ -4819,7 +4064,7 @@
         <w:pStyle w:val="Heading2"/>
       </w:pPr>
       <w:r>
-        <w:t>12.2 敌人属性速查</w:t>
+        <w:t>12.2 敌人速查</w:t>
       </w:r>
     </w:p>
     <w:tbl>
@@ -4918,7 +4163,7 @@
                 <w:b/>
                 <w:sz w:val="18"/>
               </w:rPr>
-              <w:t>攻击方式</w:t>
+              <w:t>方式</w:t>
             </w:r>
           </w:p>
         </w:tc>
@@ -5158,7 +4403,7 @@
               <w:rPr>
                 <w:sz w:val="18"/>
               </w:rPr>
-              <w:t>远程单发毒球</w:t>
+              <w:t>毒球</w:t>
             </w:r>
           </w:p>
         </w:tc>
@@ -5238,7 +4483,7 @@
               <w:rPr>
                 <w:sz w:val="18"/>
               </w:rPr>
-              <w:t>远程单发冰刺</w:t>
+              <w:t>冰刺</w:t>
             </w:r>
           </w:p>
         </w:tc>
@@ -5305,7 +4550,7 @@
               <w:rPr>
                 <w:sz w:val="18"/>
               </w:rPr>
-              <w:t>Slam 30</w:t>
+              <w:t>S30</w:t>
             </w:r>
           </w:p>
         </w:tc>
@@ -5318,7 +4563,7 @@
               <w:rPr>
                 <w:sz w:val="18"/>
               </w:rPr>
-              <w:t>范围重击</w:t>
+              <w:t>重击</w:t>
             </w:r>
           </w:p>
         </w:tc>

</xml_diff>